<commit_message>
Update resume (docx and pdf)
Co-Authored-By: Claude Sonnet 4.6 <noreply@anthropic.com>
</commit_message>
<xml_diff>
--- a/Assets/JakeBCoffmanResume.docx
+++ b/Assets/JakeBCoffmanResume.docx
@@ -82,7 +82,7 @@
           <w:rPr>
             <w:rStyle w:val="Hyperlink"/>
           </w:rPr>
-          <w:t>JBCoffman@gmail.com</w:t>
+          <w:t>Hello@JakeCoffman.me</w:t>
         </w:r>
       </w:hyperlink>
       <w:r>
@@ -1224,27 +1224,7 @@
           <w:sz w:val="21"/>
           <w:szCs w:val="21"/>
         </w:rPr>
-        <w:t>Architected the 0→1 strategy</w:t>
-      </w:r>
-      <w:r>
-        <w:rPr>
-          <w:rFonts w:ascii="Garamond" w:hAnsi="Garamond"/>
-          <w:b/>
-          <w:bCs/>
-          <w:sz w:val="21"/>
-          <w:szCs w:val="21"/>
-        </w:rPr>
-        <w:t>:</w:t>
-      </w:r>
-      <w:r>
-        <w:rPr>
-          <w:rFonts w:ascii="Garamond" w:hAnsi="Garamond"/>
-          <w:b/>
-          <w:bCs/>
-          <w:sz w:val="21"/>
-          <w:szCs w:val="21"/>
-        </w:rPr>
-        <w:t xml:space="preserve"> </w:t>
+        <w:t xml:space="preserve">Architected the 0→1 strategy: </w:t>
       </w:r>
       <w:r>
         <w:rPr>
@@ -3066,25 +3046,7 @@
           <w:sz w:val="21"/>
           <w:szCs w:val="21"/>
         </w:rPr>
-        <w:t xml:space="preserve"> tickets monthly with 95%+ CSAT; built an incident management framework that </w:t>
-      </w:r>
-      <w:proofErr w:type="gramStart"/>
-      <w:r>
-        <w:rPr>
-          <w:rFonts w:ascii="Garamond" w:hAnsi="Garamond"/>
-          <w:sz w:val="21"/>
-          <w:szCs w:val="21"/>
-        </w:rPr>
-        <w:t>handled</w:t>
-      </w:r>
-      <w:proofErr w:type="gramEnd"/>
-      <w:r>
-        <w:rPr>
-          <w:rFonts w:ascii="Garamond" w:hAnsi="Garamond"/>
-          <w:sz w:val="21"/>
-          <w:szCs w:val="21"/>
-        </w:rPr>
-        <w:t xml:space="preserve"> 100x normal volumes</w:t>
+        <w:t xml:space="preserve"> tickets monthly with 95%+ CSAT; built an incident management framework that handled 100x normal volumes</w:t>
       </w:r>
       <w:r>
         <w:rPr>
@@ -6748,6 +6710,7 @@
   <w:style w:type="character" w:default="1" w:styleId="DefaultParagraphFont">
     <w:name w:val="Default Paragraph Font"/>
     <w:uiPriority w:val="1"/>
+    <w:semiHidden/>
     <w:unhideWhenUsed/>
   </w:style>
   <w:style w:type="table" w:default="1" w:styleId="TableNormal">

</xml_diff>